<commit_message>
Added last bit of ch4 stuff
</commit_message>
<xml_diff>
--- a/docs/assessments/midterm/F26-midterm.docx
+++ b/docs/assessments/midterm/F26-midterm.docx
@@ -1349,51 +1349,6 @@
     <w:p/>
     <w:p/>
     <w:p>
-      <w:r>
-        <w:rPr>
-          <w:b/>
-          <w:bCs/>
-        </w:rPr>
-        <w:t>Extra Credit:</w:t>
-      </w:r>
-      <w:r>
-        <w:t xml:space="preserve"> You may indicate how many extra credit points you want for this question (where 1 point is about </w:t>
-      </w:r>
-      <w:r>
-        <w:t>2.5</w:t>
-      </w:r>
-      <w:r>
-        <w:t xml:space="preserve">% of the exam grade). However, there is a catch. The average amount points selected </w:t>
-      </w:r>
-      <w:r>
-        <w:t>for</w:t>
-      </w:r>
-      <w:r>
-        <w:t xml:space="preserve"> the entire class for this extra credit opportunity may not exceed </w:t>
-      </w:r>
-      <w:r>
-        <w:t>1</w:t>
-      </w:r>
-      <w:r>
-        <w:t xml:space="preserve">. Should the average exceed </w:t>
-      </w:r>
-      <w:r>
-        <w:t>1</w:t>
-      </w:r>
-      <w:r>
-        <w:t xml:space="preserve"> point, no students will receive the extra credit for this problem</w:t>
-      </w:r>
-    </w:p>
-    <w:p/>
-    <w:p>
-      <w:r>
-        <w:t>How many points would you like? _____</w:t>
-      </w:r>
-      <w:r>
-        <w:br w:type="page"/>
-      </w:r>
-    </w:p>
-    <w:p>
       <w:pPr>
         <w:rPr>
           <w:rFonts w:eastAsiaTheme="minorEastAsia"/>
@@ -1403,7 +1358,6 @@
         <w:rPr>
           <w:rFonts w:eastAsiaTheme="minorEastAsia"/>
         </w:rPr>
-        <w:lastRenderedPageBreak/>
         <w:br w:type="page"/>
       </w:r>
     </w:p>

</xml_diff>